<commit_message>
correct bib and pdf
</commit_message>
<xml_diff>
--- a/paper/wrangleData.docx
+++ b/paper/wrangleData.docx
@@ -3,6 +3,30 @@
 <w:document xmlns:w="http://schemas.openxmlformats.org/wordprocessingml/2006/main" xmlns:m="http://schemas.openxmlformats.org/officeDocument/2006/math" xmlns:r="http://schemas.openxmlformats.org/officeDocument/2006/relationships" xmlns:o="urn:schemas-microsoft-com:office:office" xmlns:v="urn:schemas-microsoft-com:vml" xmlns:w10="urn:schemas-microsoft-com:office:word" xmlns:a="http://schemas.openxmlformats.org/drawingml/2006/main" xmlns:pic="http://schemas.openxmlformats.org/drawingml/2006/picture" xmlns:wp="http://schemas.openxmlformats.org/drawingml/2006/wordprocessingDrawing">
   <w:body>
     <w:p>
+      <w:pPr>
+        <w:pStyle w:val="Author"/>
+      </w:pPr>
+      <w:r>
+        <w:t xml:space="preserve">Yue Hu</w:t>
+      </w:r>
+    </w:p>
+    <w:p>
+      <w:pPr>
+        <w:pStyle w:val="Author"/>
+      </w:pPr>
+      <w:r>
+        <w:t xml:space="preserve">Yuehong Cassandra Tai</w:t>
+      </w:r>
+    </w:p>
+    <w:p>
+      <w:pPr>
+        <w:pStyle w:val="Author"/>
+      </w:pPr>
+      <w:r>
+        <w:t xml:space="preserve">Frederick Solt</w:t>
+      </w:r>
+    </w:p>
+    <w:p>
       <w:r>
         <w:br w:type="page"/>
       </w:r>
@@ -27,7 +51,7 @@
         <w:t xml:space="preserve"> </w:t>
       </w:r>
       <w:r>
-        <w:t xml:space="preserve">A growing volume of social science research aims to take the benefit to extend generality: they employ large quantities of data drawn from different sources</w:t>
+        <w:t xml:space="preserve">A growing volume of social science research aims to benefit from employing large quantities of data drawn from different sources</w:t>
       </w:r>
       <w:r>
         <w:t xml:space="preserve"> </w:t>
@@ -117,12 +141,12 @@
       <w:r>
         <w:t xml:space="preserve"> </w:t>
       </w:r>
-      <w:hyperlink w:anchor="ref-Slomczynsi2025">
+      <w:hyperlink w:anchor="ref-Slomczynski2025">
         <w:r>
           <w:rPr>
             <w:rStyle w:val="Hyperlink"/>
           </w:rPr>
-          <w:t xml:space="preserve">Slomczynsi, Tomescu-Dubrow, and Wysmulek 2025</w:t>
+          <w:t xml:space="preserve">Slomczynski, Tomescu-Dubrow, and Wysmulek 2025</w:t>
         </w:r>
       </w:hyperlink>
       <w:r>
@@ -238,7 +262,7 @@
         <w:pStyle w:val="BodyText"/>
       </w:pPr>
       <w:r>
-        <w:t xml:space="preserve">In short, incomplete or inaccurate data entry, the absence of reproducibility, and trackless human discretion in manual janitor work have collectively become major obstacles on the way to data harmonization, yet these challenges have received surprisingly little attention.</w:t>
+        <w:t xml:space="preserve">In short, incomplete or inaccurate data entry, the absence of reproducibility, and unidentifiable human discretion in manual janitor work have collectively become major obstacles on the way to data harmonization, yet these challenges have received surprisingly little attention.</w:t>
       </w:r>
       <w:r>
         <w:t xml:space="preserve"> </w:t>
@@ -364,7 +388,7 @@
         <w:t xml:space="preserve">T</w:t>
       </w:r>
       <w:r>
-        <w:t xml:space="preserve">eam-based concept construct and data selection;</w:t>
+        <w:t xml:space="preserve">eam-based construct building and data selection;</w:t>
       </w:r>
     </w:p>
     <w:p>
@@ -428,7 +452,7 @@
         <w:t xml:space="preserve"> </w:t>
       </w:r>
       <w:r>
-        <w:t xml:space="preserve">SWIID is a long-running effort to provide harmonized income inequality statistics with the broadest possible country and year coverage</w:t>
+        <w:t xml:space="preserve">The SWIID is a long-running effort to provide harmonized income inequality statistics with the broadest possible country and year coverage</w:t>
       </w:r>
       <w:r>
         <w:t xml:space="preserve"> </w:t>
@@ -436,12 +460,12 @@
       <w:r>
         <w:t xml:space="preserve">(</w:t>
       </w:r>
-      <w:hyperlink w:anchor="ref-Solt2020">
+      <w:hyperlink w:anchor="ref-Solt2020a">
         <w:r>
           <w:rPr>
             <w:rStyle w:val="Hyperlink"/>
           </w:rPr>
-          <w:t xml:space="preserve">Solt 2020</w:t>
+          <w:t xml:space="preserve">Solt 2020a</w:t>
         </w:r>
       </w:hyperlink>
       <w:r>
@@ -503,7 +527,7 @@
         <w:t xml:space="preserve"> </w:t>
       </w:r>
       <w:r>
-        <w:t xml:space="preserve">(see e.g.,</w:t>
+        <w:t xml:space="preserve">(see, e.g.,</w:t>
       </w:r>
       <w:r>
         <w:t xml:space="preserve"> </w:t>
@@ -548,19 +572,25 @@
       <w:r>
         <w:t xml:space="preserve">(</w:t>
       </w:r>
-      <w:hyperlink w:anchor="ref-Solt2020">
+      <w:hyperlink w:anchor="ref-Solt2020b">
         <w:r>
           <w:rPr>
             <w:rStyle w:val="Hyperlink"/>
           </w:rPr>
-          <w:t xml:space="preserve">Solt 2020</w:t>
+          <w:t xml:space="preserve">Solt 2020b</w:t>
         </w:r>
       </w:hyperlink>
       <w:r>
         <w:t xml:space="preserve">)</w:t>
       </w:r>
       <w:r>
-        <w:t xml:space="preserve">, which has been applied in a complete pipeline for a variety of topics including gender egalitarianism</w:t>
+        <w:t xml:space="preserve">.</w:t>
+      </w:r>
+      <w:r>
+        <w:t xml:space="preserve"> </w:t>
+      </w:r>
+      <w:r>
+        <w:t xml:space="preserve">DCPO has been applied in a complete pipeline for a variety of topics, including gender egalitarianism</w:t>
       </w:r>
       <w:r>
         <w:t xml:space="preserve"> </w:t>
@@ -620,10 +650,13 @@
         <w:t xml:space="preserve">)</w:t>
       </w:r>
       <w:r>
-        <w:t xml:space="preserve"> </w:t>
-      </w:r>
-      <w:r>
-        <w:t xml:space="preserve">among other aspects of public opinion and open it freely for global researchers (see the data available at</w:t>
+        <w:t xml:space="preserve">, among other aspects of public opinion.</w:t>
+      </w:r>
+      <w:r>
+        <w:t xml:space="preserve"> </w:t>
+      </w:r>
+      <w:r>
+        <w:t xml:space="preserve">The DCPO R package, documentation, and related datasets are publicly available (see the data available at</w:t>
       </w:r>
       <w:r>
         <w:t xml:space="preserve"> </w:t>
@@ -689,7 +722,7 @@
         <w:t xml:space="preserve"> </w:t>
       </w:r>
       <w:r>
-        <w:t xml:space="preserve">lists examples of misrouted financial transactions and airline flights.</w:t>
+        <w:t xml:space="preserve">listed examples of misrouted financial transactions and airline flights.</w:t>
       </w:r>
       <w:r>
         <w:t xml:space="preserve"> </w:t>
@@ -738,7 +771,7 @@
         <w:t xml:space="preserve"> </w:t>
       </w:r>
       <w:r>
-        <w:t xml:space="preserve">We begin with teamwork and discuss the latter in</w:t>
+        <w:t xml:space="preserve">We begin with teamwork and discuss automation in</w:t>
       </w:r>
       <w:r>
         <w:t xml:space="preserve"> </w:t>
@@ -748,7 +781,7 @@
           <w:rPr>
             <w:rStyle w:val="Hyperlink"/>
           </w:rPr>
-          <w:t xml:space="preserve">OSM 2.2</w:t>
+          <w:t xml:space="preserve">Section 2.2</w:t>
         </w:r>
       </w:hyperlink>
       <w:r>
@@ -758,7 +791,7 @@
         <w:t xml:space="preserve"> </w:t>
       </w:r>
       <w:r>
-        <w:t xml:space="preserve">The goals are to establish a shared understanding on the conceptualized construct, select valid data for later measurement and/or analyses, and reduce biases arising from inconsistent human judgment.</w:t>
+        <w:t xml:space="preserve">The goals when working as a team are to establish a shared understanding of the conceptualized construct, select valid data for later measurement and/or analyses, and reduce biases arising from inconsistent human judgment.</w:t>
       </w:r>
       <w:r>
         <w:t xml:space="preserve"> </w:t>
@@ -772,13 +805,13 @@
         <w:pStyle w:val="BodyText"/>
       </w:pPr>
       <w:r>
-        <w:t xml:space="preserve">A deliberative set requires all team members—whether several coauthors or a primary author with one or more RAs—to have a clear understanding of the research questions and associated data goals.</w:t>
-      </w:r>
-      <w:r>
-        <w:t xml:space="preserve"> </w:t>
-      </w:r>
-      <w:r>
-        <w:t xml:space="preserve">This shared foundation help members identify relevant data sources and discover additional materials that are not in the initial plan.</w:t>
+        <w:t xml:space="preserve">A deliberative process requires all team members—whether several coauthors or a primary author with one or more RAs—to have a clear understanding of the research questions and associated data goals.</w:t>
+      </w:r>
+      <w:r>
+        <w:t xml:space="preserve"> </w:t>
+      </w:r>
+      <w:r>
+        <w:t xml:space="preserve">This shared foundation helps members identify relevant data sources and discover additional materials that are not in the initial plan.</w:t>
       </w:r>
     </w:p>
     <w:p>
@@ -792,7 +825,7 @@
         <w:t xml:space="preserve"> </w:t>
       </w:r>
       <w:r>
-        <w:t xml:space="preserve">They were provided a list of sources to start with, mainly from national statistic bureaus, but also told that updated statistics for some countries may come from academic papers, published documents, and other sources, and encouraged to add each of these new sources by recording a valid link.</w:t>
+        <w:t xml:space="preserve">They were provided a list of sources to start with, mainly from national statistics bureaus, but also told that updated statistics for some countries may come from academic papers, published documents, and other sources, and encouraged to add each of these new sources by recording a valid link.</w:t>
       </w:r>
     </w:p>
     <w:p>
@@ -914,12 +947,12 @@
       <w:r>
         <w:t xml:space="preserve">(</w:t>
       </w:r>
-      <w:hyperlink w:anchor="ref-Slomczynsi2025">
+      <w:hyperlink w:anchor="ref-Slomczynski2025">
         <w:r>
           <w:rPr>
             <w:rStyle w:val="Hyperlink"/>
           </w:rPr>
-          <w:t xml:space="preserve">Slomczynsi, Tomescu-Dubrow, and Wysmulek 2025</w:t>
+          <w:t xml:space="preserve">Slomczynski, Tomescu-Dubrow, and Wysmulek 2025</w:t>
         </w:r>
       </w:hyperlink>
       <w:r>
@@ -960,7 +993,7 @@
         <w:t xml:space="preserve"> </w:t>
       </w:r>
       <w:r>
-        <w:t xml:space="preserve">These members draw on their linguistic and cultural expertise to detect extra sources in non-English languages and improve the precision of the data selection.</w:t>
+        <w:t xml:space="preserve">These members draw on their linguistic and cultural expertise to detect additional sources in non-English languages and improve the precision of the data selection.</w:t>
       </w:r>
       <w:r>
         <w:t xml:space="preserve"> </w:t>
@@ -998,7 +1031,7 @@
         <w:pStyle w:val="BodyText"/>
       </w:pPr>
       <w:r>
-        <w:t xml:space="preserve">In the DCPO case, once the research team manually codes the question numbers of relevant items, response scales, survey weights, project names, fieldwork waves, and dates from the raw survey files and accompanying documentation, data entry can be automated through the R-based software,</w:t>
+        <w:t xml:space="preserve">In the case of DCPO, once the research team manually codes the question numbers of relevant items, response scales, survey weights, project names, fieldwork waves, and dates from the raw survey files and accompanying documentation, data entry can be automated through the R-based software,</w:t>
       </w:r>
       <w:r>
         <w:t xml:space="preserve"> </w:t>
@@ -1015,12 +1048,12 @@
       <w:r>
         <w:t xml:space="preserve">(</w:t>
       </w:r>
-      <w:hyperlink w:anchor="ref-SoltEtAl2018a">
+      <w:hyperlink w:anchor="ref-SoltEtAl2019">
         <w:r>
           <w:rPr>
             <w:rStyle w:val="Hyperlink"/>
           </w:rPr>
-          <w:t xml:space="preserve">Solt, Hu, and Tai 2018</w:t>
+          <w:t xml:space="preserve">Solt et al. 2019</w:t>
         </w:r>
       </w:hyperlink>
       <w:r>
@@ -1045,7 +1078,7 @@
         <w:t xml:space="preserve"> </w:t>
       </w:r>
       <w:r>
-        <w:t xml:space="preserve">To enable automation, raw data should be pre-processed to conform to</w:t>
+        <w:t xml:space="preserve">To enable automation, raw data are pre-processed to conform to</w:t>
       </w:r>
       <w:r>
         <w:t xml:space="preserve"> </w:t>
@@ -1131,7 +1164,7 @@
             <w:r>
               <w:drawing>
                 <wp:inline>
-                  <wp:extent cx="3696101" cy="1848050"/>
+                  <wp:extent cx="4876800" cy="2438400"/>
                   <wp:effectExtent b="0" l="0" r="0" t="0"/>
                   <wp:docPr descr="" title="" id="27" name="Picture"/>
                   <a:graphic>
@@ -1152,7 +1185,7 @@
                         <pic:spPr bwMode="auto">
                           <a:xfrm>
                             <a:off x="0" y="0"/>
-                            <a:ext cx="3696101" cy="1848050"/>
+                            <a:ext cx="4876800" cy="2438400"/>
                           </a:xfrm>
                           <a:prstGeom prst="rect">
                             <a:avLst/>
@@ -1213,7 +1246,7 @@
         </w:r>
       </w:hyperlink>
       <w:r>
-        <w:t xml:space="preserve">, the current version of SWIID collects 76% of the observations through APIs.</w:t>
+        <w:t xml:space="preserve">, the current version of SWIID collects 76% of its raw observations through APIs.</w:t>
       </w:r>
       <w:r>
         <w:t xml:space="preserve"> </w:t>
@@ -1253,13 +1286,13 @@
         <w:pStyle w:val="BodyText"/>
       </w:pPr>
       <w:r>
-        <w:t xml:space="preserve">Returning to the case of the SWIID: when no API is available, the automation script downloads and reads any available spreadsheets.</w:t>
-      </w:r>
-      <w:r>
-        <w:t xml:space="preserve"> </w:t>
-      </w:r>
-      <w:r>
-        <w:t xml:space="preserve">In the absence of a spreadsheet, the process of scraping the data, either directly from the web or, preferably, from a pdf file, is automated</w:t>
+        <w:t xml:space="preserve">Returning to the case of the SWIID, when no API is available, the automation script downloads and reads any available spreadsheets.</w:t>
+      </w:r>
+      <w:r>
+        <w:t xml:space="preserve"> </w:t>
+      </w:r>
+      <w:r>
+        <w:t xml:space="preserve">In the absence of a spreadsheet, the process of scraping the data, either directly from the web or, preferably, from a PDF file, is automated</w:t>
       </w:r>
       <w:r>
         <w:t xml:space="preserve"> </w:t>
@@ -1302,7 +1335,7 @@
         <w:t xml:space="preserve"> </w:t>
       </w:r>
       <w:r>
-        <w:t xml:space="preserve">Nevertheless, it enables efficient integration of updates and revisions whenever data collection program is rerun.</w:t>
+        <w:t xml:space="preserve">Nevertheless, it enables efficient integration of updates and revisions whenever the data collection program is rerun.</w:t>
       </w:r>
     </w:p>
     <w:p>
@@ -1362,7 +1395,7 @@
         <w:pStyle w:val="BodyText"/>
       </w:pPr>
       <w:r>
-        <w:t xml:space="preserve">For data that one must enter manually, teamwork is crucial.</w:t>
+        <w:t xml:space="preserve">For data that must be entered manually, teamwork is crucial.</w:t>
       </w:r>
       <w:r>
         <w:t xml:space="preserve"> </w:t>
@@ -1429,7 +1462,7 @@
         <w:t xml:space="preserve"> </w:t>
       </w:r>
       <w:r>
-        <w:t xml:space="preserve">For example, OCR may misread characters or digits, and software bugs can affect quality and reproducibility of the process.</w:t>
+        <w:t xml:space="preserve">For example, OCR may misread characters or digits, and software bugs can affect the quality and reproducibility of the process.</w:t>
       </w:r>
       <w:r>
         <w:t xml:space="preserve"> </w:t>
@@ -1736,7 +1769,7 @@
         <w:t xml:space="preserve"> </w:t>
       </w:r>
       <w:r>
-        <w:t xml:space="preserve">We reached at this step for all the DCPO projects so far.</w:t>
+        <w:t xml:space="preserve">We have reached this step for all the DCPO projects so far.</w:t>
       </w:r>
       <w:r>
         <w:t xml:space="preserve"> </w:t>
@@ -1874,7 +1907,7 @@
         <w:t xml:space="preserve"> </w:t>
       </w:r>
       <w:r>
-        <w:t xml:space="preserve">presents the whole process of the 3-step routine of data wrangling for later harmonization phase.</w:t>
+        <w:t xml:space="preserve">presents the whole process of the 3-step routine of data wrangling for the later harmonization phase.</w:t>
       </w:r>
       <w:r>
         <w:t xml:space="preserve"> </w:t>
@@ -1951,12 +1984,12 @@
       <w:r>
         <w:t xml:space="preserve">(</w:t>
       </w:r>
-      <w:hyperlink w:anchor="ref-Slomczynsi2025">
+      <w:hyperlink w:anchor="ref-Slomczynski2025">
         <w:r>
           <w:rPr>
             <w:rStyle w:val="Hyperlink"/>
           </w:rPr>
-          <w:t xml:space="preserve">Slomczynsi, Tomescu-Dubrow, and Wysmulek 2025</w:t>
+          <w:t xml:space="preserve">Slomczynski, Tomescu-Dubrow, and Wysmulek 2025</w:t>
         </w:r>
       </w:hyperlink>
       <w:r>
@@ -2099,7 +2132,7 @@
         <w:pStyle w:val="BodyText"/>
       </w:pPr>
       <w:r>
-        <w:t xml:space="preserve">For retrospective (or called</w:t>
+        <w:t xml:space="preserve">For retrospective,</w:t>
       </w:r>
       <w:r>
         <w:t xml:space="preserve"> </w:t>
@@ -2108,7 +2141,10 @@
         <w:t xml:space="preserve">“ex-post”</w:t>
       </w:r>
       <w:r>
-        <w:t xml:space="preserve">) harmonization projects, careful attention to pre-harmonization stages substantially contributes to overall data quality.</w:t>
+        <w:t xml:space="preserve"> </w:t>
+      </w:r>
+      <w:r>
+        <w:t xml:space="preserve">harmonization projects, careful attention to pre-harmonization stages substantially contributes to overall data quality.</w:t>
       </w:r>
       <w:r>
         <w:t xml:space="preserve"> </w:t>
@@ -2117,13 +2153,23 @@
         <w:t xml:space="preserve">While some error is inevitable, with responsible researcher oversight, data-entry errors can be minimized while transparency, openness, and research credibility continue to grow.</w:t>
       </w:r>
     </w:p>
+    <w:bookmarkEnd w:id="38"/>
+    <w:bookmarkStart w:id="39" w:name="notes"/>
+    <w:p>
+      <w:pPr>
+        <w:pStyle w:val="Heading1"/>
+      </w:pPr>
+      <w:r>
+        <w:t xml:space="preserve">Notes</w:t>
+      </w:r>
+    </w:p>
     <w:p>
       <w:r>
         <w:br w:type="page"/>
       </w:r>
     </w:p>
-    <w:bookmarkEnd w:id="38"/>
-    <w:bookmarkStart w:id="72" w:name="references"/>
+    <w:bookmarkEnd w:id="39"/>
+    <w:bookmarkStart w:id="75" w:name="references"/>
     <w:p>
       <w:pPr>
         <w:pStyle w:val="Heading1"/>
@@ -2132,8 +2178,8 @@
         <w:t xml:space="preserve">References</w:t>
       </w:r>
     </w:p>
-    <w:bookmarkStart w:id="71" w:name="refs-main"/>
-    <w:bookmarkStart w:id="39" w:name="ref-BarchardPace2011"/>
+    <w:bookmarkStart w:id="74" w:name="refs-main"/>
+    <w:bookmarkStart w:id="40" w:name="ref-BarchardPace2011"/>
     <w:p>
       <w:pPr>
         <w:pStyle w:val="FirstParagraph"/>
@@ -2164,8 +2210,8 @@
         <w:t xml:space="preserve">27(5): 1834–39.</w:t>
       </w:r>
     </w:p>
-    <w:bookmarkEnd w:id="39"/>
-    <w:bookmarkStart w:id="40" w:name="ref-CaugheyEtAl2019"/>
+    <w:bookmarkEnd w:id="40"/>
+    <w:bookmarkStart w:id="41" w:name="ref-CaugheyEtAl2019"/>
     <w:p>
       <w:pPr>
         <w:pStyle w:val="BodyText"/>
@@ -2193,8 +2239,8 @@
         <w:t xml:space="preserve">: 1–20.</w:t>
       </w:r>
     </w:p>
-    <w:bookmarkEnd w:id="40"/>
-    <w:bookmarkStart w:id="41" w:name="ref-ChangLi2015"/>
+    <w:bookmarkEnd w:id="41"/>
+    <w:bookmarkStart w:id="42" w:name="ref-ChangLi2015"/>
     <w:p>
       <w:pPr>
         <w:pStyle w:val="BodyText"/>
@@ -2246,8 +2292,8 @@
         <w:t xml:space="preserve">7: 1–25.</w:t>
       </w:r>
     </w:p>
-    <w:bookmarkEnd w:id="41"/>
-    <w:bookmarkStart w:id="42" w:name="ref-ChengEtAl2024"/>
+    <w:bookmarkEnd w:id="42"/>
+    <w:bookmarkStart w:id="43" w:name="ref-ChengEtAl2024"/>
     <w:p>
       <w:pPr>
         <w:pStyle w:val="BodyText"/>
@@ -2278,8 +2324,8 @@
         <w:t xml:space="preserve">11(1): 152.</w:t>
       </w:r>
     </w:p>
-    <w:bookmarkEnd w:id="42"/>
-    <w:bookmarkStart w:id="43" w:name="ref-Claassen2019"/>
+    <w:bookmarkEnd w:id="43"/>
+    <w:bookmarkStart w:id="44" w:name="ref-Claassen2019"/>
     <w:p>
       <w:pPr>
         <w:pStyle w:val="BodyText"/>
@@ -2310,8 +2356,8 @@
         <w:t xml:space="preserve">27(1): 1–20.</w:t>
       </w:r>
     </w:p>
-    <w:bookmarkEnd w:id="43"/>
-    <w:bookmarkStart w:id="44" w:name="ref-DubrowTomescu-Dubrow2016"/>
+    <w:bookmarkEnd w:id="44"/>
+    <w:bookmarkStart w:id="45" w:name="ref-DubrowTomescu-Dubrow2016"/>
     <w:p>
       <w:pPr>
         <w:pStyle w:val="BodyText"/>
@@ -2342,8 +2388,8 @@
         <w:t xml:space="preserve">50(4): 1449–67.</w:t>
       </w:r>
     </w:p>
-    <w:bookmarkEnd w:id="44"/>
-    <w:bookmarkStart w:id="45" w:name="ref-EngzellRohrer2021"/>
+    <w:bookmarkEnd w:id="45"/>
+    <w:bookmarkStart w:id="46" w:name="ref-EngzellRohrer2021"/>
     <w:p>
       <w:pPr>
         <w:pStyle w:val="BodyText"/>
@@ -2374,8 +2420,8 @@
         <w:t xml:space="preserve">54(2): 297–300.</w:t>
       </w:r>
     </w:p>
-    <w:bookmarkEnd w:id="45"/>
-    <w:bookmarkStart w:id="46" w:name="ref-HaegemansEtAl2019"/>
+    <w:bookmarkEnd w:id="46"/>
+    <w:bookmarkStart w:id="47" w:name="ref-HaegemansEtAl2019"/>
     <w:p>
       <w:pPr>
         <w:pStyle w:val="BodyText"/>
@@ -2406,8 +2452,8 @@
         <w:t xml:space="preserve">56(1): 1–14.</w:t>
       </w:r>
     </w:p>
-    <w:bookmarkEnd w:id="46"/>
-    <w:bookmarkStart w:id="47" w:name="ref-HagemannEtAl2017"/>
+    <w:bookmarkEnd w:id="47"/>
+    <w:bookmarkStart w:id="48" w:name="ref-HagemannEtAl2017"/>
     <w:p>
       <w:pPr>
         <w:pStyle w:val="BodyText"/>
@@ -2450,8 +2496,8 @@
         <w:t xml:space="preserve">50(6): 850–76.</w:t>
       </w:r>
     </w:p>
-    <w:bookmarkEnd w:id="47"/>
-    <w:bookmarkStart w:id="48" w:name="ref-HolzmeisterEtAl2024"/>
+    <w:bookmarkEnd w:id="48"/>
+    <w:bookmarkStart w:id="49" w:name="ref-HolzmeisterEtAl2024"/>
     <w:p>
       <w:pPr>
         <w:pStyle w:val="BodyText"/>
@@ -2482,8 +2528,8 @@
         <w:t xml:space="preserve">121(32): e2403490121.</w:t>
       </w:r>
     </w:p>
-    <w:bookmarkEnd w:id="48"/>
-    <w:bookmarkStart w:id="49" w:name="ref-HuSolt2025"/>
+    <w:bookmarkEnd w:id="49"/>
+    <w:bookmarkStart w:id="50" w:name="ref-HuSolt2025"/>
     <w:p>
       <w:pPr>
         <w:pStyle w:val="BodyText"/>
@@ -2514,8 +2560,8 @@
         <w:t xml:space="preserve">55(e71): 1–10.</w:t>
       </w:r>
     </w:p>
-    <w:bookmarkEnd w:id="49"/>
-    <w:bookmarkStart w:id="50" w:name="ref-HuEtAl2025a"/>
+    <w:bookmarkEnd w:id="50"/>
+    <w:bookmarkStart w:id="51" w:name="ref-HuEtAl2025a"/>
     <w:p>
       <w:pPr>
         <w:pStyle w:val="BodyText"/>
@@ -2546,8 +2592,8 @@
         <w:t xml:space="preserve">13(1): 237–43.</w:t>
       </w:r>
     </w:p>
-    <w:bookmarkEnd w:id="50"/>
-    <w:bookmarkStart w:id="51" w:name="ref-Huntington-KleinEtAl2025"/>
+    <w:bookmarkEnd w:id="51"/>
+    <w:bookmarkStart w:id="52" w:name="ref-Huntington-KleinEtAl2025"/>
     <w:p>
       <w:pPr>
         <w:pStyle w:val="BodyText"/>
@@ -2595,8 +2641,8 @@
         <w:t xml:space="preserve">.”</w:t>
       </w:r>
     </w:p>
-    <w:bookmarkEnd w:id="51"/>
-    <w:bookmarkStart w:id="52" w:name="ref-KizilovaEtAl2024"/>
+    <w:bookmarkEnd w:id="52"/>
+    <w:bookmarkStart w:id="53" w:name="ref-KizilovaEtAl2024"/>
     <w:p>
       <w:pPr>
         <w:pStyle w:val="BodyText"/>
@@ -2681,8 +2727,8 @@
         <w:t xml:space="preserve">, John Wiley &amp; Sons, Ltd, 39–56.</w:t>
       </w:r>
     </w:p>
-    <w:bookmarkEnd w:id="52"/>
-    <w:bookmarkStart w:id="53" w:name="ref-Koc2025"/>
+    <w:bookmarkEnd w:id="53"/>
+    <w:bookmarkStart w:id="54" w:name="ref-Koc2025"/>
     <w:p>
       <w:pPr>
         <w:pStyle w:val="BodyText"/>
@@ -2710,8 +2756,8 @@
         <w:t xml:space="preserve">.</w:t>
       </w:r>
     </w:p>
-    <w:bookmarkEnd w:id="53"/>
-    <w:bookmarkStart w:id="54" w:name="ref-Kolczynska2022"/>
+    <w:bookmarkEnd w:id="54"/>
+    <w:bookmarkStart w:id="55" w:name="ref-Kolczynska2022"/>
     <w:p>
       <w:pPr>
         <w:pStyle w:val="BodyText"/>
@@ -2754,8 +2800,8 @@
         <w:t xml:space="preserve">15(1): 62–72.</w:t>
       </w:r>
     </w:p>
-    <w:bookmarkEnd w:id="54"/>
-    <w:bookmarkStart w:id="55" w:name="ref-Kritzinger2025"/>
+    <w:bookmarkEnd w:id="55"/>
+    <w:bookmarkStart w:id="56" w:name="ref-Kritzinger2025"/>
     <w:p>
       <w:pPr>
         <w:pStyle w:val="BodyText"/>
@@ -2783,8 +2829,8 @@
         <w:t xml:space="preserve">.</w:t>
       </w:r>
     </w:p>
-    <w:bookmarkEnd w:id="55"/>
-    <w:bookmarkStart w:id="56" w:name="ref-Liu2019"/>
+    <w:bookmarkEnd w:id="56"/>
+    <w:bookmarkStart w:id="57" w:name="ref-Liu2019"/>
     <w:p>
       <w:pPr>
         <w:pStyle w:val="BodyText"/>
@@ -2815,8 +2861,8 @@
         <w:t xml:space="preserve">5: 2378023119849803.</w:t>
       </w:r>
     </w:p>
-    <w:bookmarkEnd w:id="56"/>
-    <w:bookmarkStart w:id="57" w:name="ref-Lohr2014"/>
+    <w:bookmarkEnd w:id="57"/>
+    <w:bookmarkStart w:id="58" w:name="ref-Lohr2014"/>
     <w:p>
       <w:pPr>
         <w:pStyle w:val="BodyText"/>
@@ -2856,8 +2902,8 @@
         <w:t xml:space="preserve">.</w:t>
       </w:r>
     </w:p>
-    <w:bookmarkEnd w:id="57"/>
-    <w:bookmarkStart w:id="58" w:name="ref-OpenScienceCollaboration2015"/>
+    <w:bookmarkEnd w:id="58"/>
+    <w:bookmarkStart w:id="59" w:name="ref-OpenScienceCollaboration2015"/>
     <w:p>
       <w:pPr>
         <w:pStyle w:val="BodyText"/>
@@ -2888,8 +2934,8 @@
         <w:t xml:space="preserve">349(6251): aac4716.</w:t>
       </w:r>
     </w:p>
-    <w:bookmarkEnd w:id="58"/>
-    <w:bookmarkStart w:id="59" w:name="ref-OserZur2025"/>
+    <w:bookmarkEnd w:id="59"/>
+    <w:bookmarkStart w:id="60" w:name="ref-OserZur2025"/>
     <w:p>
       <w:pPr>
         <w:pStyle w:val="BodyText"/>
@@ -2968,8 +3014,8 @@
         <w:t xml:space="preserve">0(0): Online.</w:t>
       </w:r>
     </w:p>
-    <w:bookmarkEnd w:id="59"/>
-    <w:bookmarkStart w:id="60" w:name="ref-RugglesEtAl2024"/>
+    <w:bookmarkEnd w:id="60"/>
+    <w:bookmarkStart w:id="61" w:name="ref-RugglesEtAl2024"/>
     <w:p>
       <w:pPr>
         <w:pStyle w:val="BodyText"/>
@@ -3075,8 +3121,8 @@
         <w:t xml:space="preserve">, John Wiley &amp; Sons, Ltd, 207–26.</w:t>
       </w:r>
     </w:p>
-    <w:bookmarkEnd w:id="60"/>
-    <w:bookmarkStart w:id="61" w:name="ref-Sepulveda2024"/>
+    <w:bookmarkEnd w:id="61"/>
+    <w:bookmarkStart w:id="62" w:name="ref-Sepulveda2024"/>
     <w:p>
       <w:pPr>
         <w:pStyle w:val="BodyText"/>
@@ -3121,14 +3167,14 @@
         <w:t xml:space="preserve">Documents.”</w:t>
       </w:r>
     </w:p>
-    <w:bookmarkEnd w:id="61"/>
-    <w:bookmarkStart w:id="62" w:name="ref-Slomczynsi2025"/>
+    <w:bookmarkEnd w:id="62"/>
+    <w:bookmarkStart w:id="63" w:name="ref-Slomczynski2025"/>
     <w:p>
       <w:pPr>
         <w:pStyle w:val="BodyText"/>
       </w:pPr>
       <w:r>
-        <w:t xml:space="preserve">Slomczynsi, Kazmierz M., Irina Tomescu-Dubrow, and Ilona Wysmulek. 2025.</w:t>
+        <w:t xml:space="preserve">Slomczynski, Kazimierz M., Irina Tomescu-Dubrow, and Ilona Wysmulek. 2025.</w:t>
       </w:r>
       <w:r>
         <w:t xml:space="preserve"> </w:t>
@@ -3150,14 +3196,46 @@
         <w:t xml:space="preserve">.</w:t>
       </w:r>
     </w:p>
-    <w:bookmarkEnd w:id="62"/>
-    <w:bookmarkStart w:id="63" w:name="ref-Solt2020"/>
+    <w:bookmarkEnd w:id="63"/>
+    <w:bookmarkStart w:id="64" w:name="ref-Solt2020a"/>
     <w:p>
       <w:pPr>
         <w:pStyle w:val="BodyText"/>
       </w:pPr>
       <w:r>
-        <w:t xml:space="preserve">Solt, Frederick. 2020.</w:t>
+        <w:t xml:space="preserve">Solt, Frederick. 2020a.</w:t>
+      </w:r>
+      <w:r>
+        <w:t xml:space="preserve"> </w:t>
+      </w:r>
+      <w:r>
+        <w:t xml:space="preserve">“Measuring Income Inequality Across Countries and over Time: The Standardized World Income Inequality Database.”</w:t>
+      </w:r>
+      <w:r>
+        <w:t xml:space="preserve"> </w:t>
+      </w:r>
+      <w:r>
+        <w:rPr>
+          <w:i/>
+          <w:iCs/>
+        </w:rPr>
+        <w:t xml:space="preserve">Social Science Quarterly</w:t>
+      </w:r>
+      <w:r>
+        <w:t xml:space="preserve"> </w:t>
+      </w:r>
+      <w:r>
+        <w:t xml:space="preserve">101(3, 3): 1183–99.</w:t>
+      </w:r>
+    </w:p>
+    <w:bookmarkEnd w:id="64"/>
+    <w:bookmarkStart w:id="65" w:name="ref-Solt2020b"/>
+    <w:p>
+      <w:pPr>
+        <w:pStyle w:val="BodyText"/>
+      </w:pPr>
+      <w:r>
+        <w:t xml:space="preserve">Solt, Frederick. 2020b.</w:t>
       </w:r>
       <w:r>
         <w:t xml:space="preserve"> </w:t>
@@ -3172,8 +3250,8 @@
         <w:t xml:space="preserve">SocArXiv.</w:t>
       </w:r>
     </w:p>
-    <w:bookmarkEnd w:id="63"/>
-    <w:bookmarkStart w:id="64" w:name="ref-SoltEtAl2016"/>
+    <w:bookmarkEnd w:id="65"/>
+    <w:bookmarkStart w:id="66" w:name="ref-SoltEtAl2016"/>
     <w:p>
       <w:pPr>
         <w:pStyle w:val="BodyText"/>
@@ -3204,8 +3282,8 @@
         <w:t xml:space="preserve">3(4): 1–7.</w:t>
       </w:r>
     </w:p>
-    <w:bookmarkEnd w:id="64"/>
-    <w:bookmarkStart w:id="65" w:name="ref-SoltEtAl2017"/>
+    <w:bookmarkEnd w:id="66"/>
+    <w:bookmarkStart w:id="67" w:name="ref-SoltEtAl2017"/>
     <w:p>
       <w:pPr>
         <w:pStyle w:val="BodyText"/>
@@ -3236,14 +3314,14 @@
         <w:t xml:space="preserve">79(3): 1079–83.</w:t>
       </w:r>
     </w:p>
-    <w:bookmarkEnd w:id="65"/>
-    <w:bookmarkStart w:id="66" w:name="ref-SoltEtAl2018a"/>
+    <w:bookmarkEnd w:id="67"/>
+    <w:bookmarkStart w:id="69" w:name="ref-SoltEtAl2019"/>
     <w:p>
       <w:pPr>
         <w:pStyle w:val="BodyText"/>
       </w:pPr>
       <w:r>
-        <w:t xml:space="preserve">Solt, Frederick, Yue Hu, and Yuehong Cassandra Tai. 2018.</w:t>
+        <w:t xml:space="preserve">Solt, Frederick, Yuehong Cassandra Tai, Yue Hu, Hyein Ko, and Byung-Deuk Woo. 2019.</w:t>
       </w:r>
       <w:r>
         <w:t xml:space="preserve"> </w:t>
@@ -3255,11 +3333,58 @@
         <w:t xml:space="preserve">DCPOtools</w:t>
       </w:r>
       <w:r>
-        <w:t xml:space="preserve">: Tools for Dynamic Comparative Public Opinion.”</w:t>
-      </w:r>
-    </w:p>
-    <w:bookmarkEnd w:id="66"/>
-    <w:bookmarkStart w:id="67" w:name="ref-TaiEtAl2024"/>
+        <w:t xml:space="preserve">:</w:t>
+      </w:r>
+      <w:r>
+        <w:t xml:space="preserve"> </w:t>
+      </w:r>
+      <w:r>
+        <w:t xml:space="preserve">Tools</w:t>
+      </w:r>
+      <w:r>
+        <w:t xml:space="preserve"> </w:t>
+      </w:r>
+      <w:r>
+        <w:t xml:space="preserve">for</w:t>
+      </w:r>
+      <w:r>
+        <w:t xml:space="preserve"> </w:t>
+      </w:r>
+      <w:r>
+        <w:t xml:space="preserve">Preparing Survey Data</w:t>
+      </w:r>
+      <w:r>
+        <w:t xml:space="preserve"> </w:t>
+      </w:r>
+      <w:r>
+        <w:t xml:space="preserve">for</w:t>
+      </w:r>
+      <w:r>
+        <w:t xml:space="preserve"> </w:t>
+      </w:r>
+      <w:r>
+        <w:t xml:space="preserve">DCPO</w:t>
+      </w:r>
+      <w:r>
+        <w:t xml:space="preserve">.”</w:t>
+      </w:r>
+      <w:r>
+        <w:t xml:space="preserve"> </w:t>
+      </w:r>
+      <w:hyperlink r:id="rId68">
+        <w:r>
+          <w:rPr>
+            <w:rStyle w:val="Hyperlink"/>
+          </w:rPr>
+          <w:t xml:space="preserve">https://github.com/fsolt/DCPOtools</w:t>
+        </w:r>
+      </w:hyperlink>
+      <w:r>
+        <w:t xml:space="preserve">.</w:t>
+      </w:r>
+    </w:p>
+    <w:bookmarkEnd w:id="69"/>
+    <w:bookmarkStart w:id="70" w:name="ref-TaiEtAl2024"/>
     <w:p>
       <w:pPr>
         <w:pStyle w:val="BodyText"/>
@@ -3290,8 +3415,8 @@
         <w:t xml:space="preserve">118(1): 512–18.</w:t>
       </w:r>
     </w:p>
-    <w:bookmarkEnd w:id="67"/>
-    <w:bookmarkStart w:id="68" w:name="ref-WooEtAl2023"/>
+    <w:bookmarkEnd w:id="70"/>
+    <w:bookmarkStart w:id="71" w:name="ref-WooEtAl2023"/>
     <w:p>
       <w:pPr>
         <w:pStyle w:val="BodyText"/>
@@ -3376,14 +3501,14 @@
         <w:t xml:space="preserve">53(2): 766–75.</w:t>
       </w:r>
     </w:p>
-    <w:bookmarkEnd w:id="68"/>
-    <w:bookmarkStart w:id="69" w:name="ref-WooEtAl2025"/>
+    <w:bookmarkEnd w:id="71"/>
+    <w:bookmarkStart w:id="72" w:name="ref-WooEtAl2025"/>
     <w:p>
       <w:pPr>
         <w:pStyle w:val="BodyText"/>
       </w:pPr>
       <w:r>
-        <w:t xml:space="preserve">Woo, Byung-Deuk, Hyein Ko, Yuehong Cassandra Tai, and Frederick Solt. 2025.</w:t>
+        <w:t xml:space="preserve">Woo, Byung-Deuk, Hyein Ko, Yuehong Cassandra Tai, Yue Hu, and Frederick Solt. 2025.</w:t>
       </w:r>
       <w:r>
         <w:t xml:space="preserve"> </w:t>
@@ -3441,8 +3566,8 @@
         <w:t xml:space="preserve">106(1): e13478.</w:t>
       </w:r>
     </w:p>
-    <w:bookmarkEnd w:id="69"/>
-    <w:bookmarkStart w:id="70" w:name="ref-WysmulekEtAl2022"/>
+    <w:bookmarkEnd w:id="72"/>
+    <w:bookmarkStart w:id="73" w:name="ref-WysmulekEtAl2022"/>
     <w:p>
       <w:pPr>
         <w:pStyle w:val="BodyText"/>
@@ -3473,10 +3598,10 @@
         <w:t xml:space="preserve">56(3): 1701–8.</w:t>
       </w:r>
     </w:p>
-    <w:bookmarkEnd w:id="70"/>
-    <w:bookmarkEnd w:id="71"/>
-    <w:bookmarkEnd w:id="72"/>
-    <w:bookmarkStart w:id="73" w:name="online-supplementary-materials"/>
+    <w:bookmarkEnd w:id="73"/>
+    <w:bookmarkEnd w:id="74"/>
+    <w:bookmarkEnd w:id="75"/>
+    <w:bookmarkStart w:id="76" w:name="online-supplementary-materials"/>
     <w:p>
       <w:pPr>
         <w:pStyle w:val="Heading1"/>
@@ -3485,8 +3610,8 @@
         <w:t xml:space="preserve">Online Supplementary Materials</w:t>
       </w:r>
     </w:p>
-    <w:bookmarkEnd w:id="73"/>
-    <w:bookmarkStart w:id="75" w:name="sec-checklist"/>
+    <w:bookmarkEnd w:id="76"/>
+    <w:bookmarkStart w:id="78" w:name="sec-checklist"/>
     <w:p>
       <w:pPr>
         <w:pStyle w:val="Heading1"/>
@@ -3530,6 +3655,9 @@
       </w:r>
       <w:r>
         <w:t xml:space="preserve">However, this general checklist can serve as a useful guide across a range of harmonization efforts.</w:t>
+      </w:r>
+      <w:r>
+        <w:t xml:space="preserve"> </w:t>
       </w:r>
     </w:p>
     <w:tbl>
@@ -3545,7 +3673,7 @@
       <w:tr>
         <w:tc>
           <w:tcPr/>
-          <w:bookmarkStart w:id="74" w:name="tbl-checklist"/>
+          <w:bookmarkStart w:id="77" w:name="tbl-checklist"/>
           <w:p>
             <w:pPr>
               <w:jc w:val="center"/>
@@ -3863,7 +3991,7 @@
                     <w:jc w:val="center"/>
                   </w:pPr>
                   <w:r>
-                    <w:t xml:space="preserve">Each team member maintains a seperate sheet for raw data collection and a log of decisions.</w:t>
+                    <w:t xml:space="preserve">Each team member maintains a separate sheet for raw data collection and a log of decisions.</w:t>
                   </w:r>
                 </w:p>
               </w:tc>
@@ -4163,13 +4291,13 @@
               </w:tc>
             </w:tr>
           </w:tbl>
-          <w:bookmarkEnd w:id="74"/>
+          <w:bookmarkEnd w:id="77"/>
           <w:p/>
         </w:tc>
       </w:tr>
     </w:tbl>
-    <w:bookmarkEnd w:id="75"/>
-    <w:bookmarkStart w:id="77" w:name="sec-packages"/>
+    <w:bookmarkEnd w:id="78"/>
+    <w:bookmarkStart w:id="80" w:name="sec-packages"/>
     <w:p>
       <w:pPr>
         <w:pStyle w:val="Heading1"/>
@@ -4189,7 +4317,7 @@
         <w:t xml:space="preserve"> </w:t>
       </w:r>
       <w:r>
-        <w:t xml:space="preserve">In this section, we introducing several packages that we used in the DCPO and SWIID projects to illustrate how automation can help reduces manual errors in these data wrangling phases.</w:t>
+        <w:t xml:space="preserve">In this section, we introduce several packages that we used in the DCPO and SWIID projects to illustrate how automation can help reduce manual errors in these data wrangling phases.</w:t>
       </w:r>
     </w:p>
     <w:p>
@@ -4677,7 +4805,7 @@
       <w:r>
         <w:t xml:space="preserve"> </w:t>
       </w:r>
-      <w:hyperlink r:id="rId76">
+      <w:hyperlink r:id="rId79">
         <w:r>
           <w:rPr>
             <w:rStyle w:val="Hyperlink"/>
@@ -5833,7 +5961,262 @@
         </w:tc>
       </w:tr>
     </w:tbl>
-    <w:bookmarkEnd w:id="77"/>
+    <w:bookmarkEnd w:id="80"/>
+    <w:bookmarkStart w:id="89" w:name="references-1"/>
+    <w:p>
+      <w:pPr>
+        <w:pStyle w:val="Heading1"/>
+      </w:pPr>
+      <w:r>
+        <w:t xml:space="preserve">References</w:t>
+      </w:r>
+    </w:p>
+    <w:bookmarkStart w:id="88" w:name="refs-appendix"/>
+    <w:bookmarkStart w:id="82" w:name="ref-Arel-BundockEtAl2025"/>
+    <w:p>
+      <w:pPr>
+        <w:pStyle w:val="FirstParagraph"/>
+      </w:pPr>
+      <w:r>
+        <w:t xml:space="preserve">Arel-Bundock, Vincent, C. J. Yetman, Nils Enevoldsen, Etienne Bacher, and Samuel Meichtry. 2025.</w:t>
+      </w:r>
+      <w:r>
+        <w:t xml:space="preserve"> </w:t>
+      </w:r>
+      <w:r>
+        <w:t xml:space="preserve">“Countrycode:</w:t>
+      </w:r>
+      <w:r>
+        <w:t xml:space="preserve"> </w:t>
+      </w:r>
+      <w:r>
+        <w:t xml:space="preserve">Convert Country Names</w:t>
+      </w:r>
+      <w:r>
+        <w:t xml:space="preserve"> </w:t>
+      </w:r>
+      <w:r>
+        <w:t xml:space="preserve">and</w:t>
+      </w:r>
+      <w:r>
+        <w:t xml:space="preserve"> </w:t>
+      </w:r>
+      <w:r>
+        <w:t xml:space="preserve">Country Codes</w:t>
+      </w:r>
+      <w:r>
+        <w:t xml:space="preserve">.”</w:t>
+      </w:r>
+      <w:r>
+        <w:t xml:space="preserve"> </w:t>
+      </w:r>
+      <w:hyperlink r:id="rId81">
+        <w:r>
+          <w:rPr>
+            <w:rStyle w:val="Hyperlink"/>
+          </w:rPr>
+          <w:t xml:space="preserve">https://cran.r-project.org/web/packages/countrycode/index.html</w:t>
+        </w:r>
+      </w:hyperlink>
+      <w:r>
+        <w:t xml:space="preserve"> </w:t>
+      </w:r>
+      <w:r>
+        <w:t xml:space="preserve">(January 6, 2026).</w:t>
+      </w:r>
+    </w:p>
+    <w:bookmarkEnd w:id="82"/>
+    <w:bookmarkStart w:id="84" w:name="ref-FirkeEtAl2024"/>
+    <w:p>
+      <w:pPr>
+        <w:pStyle w:val="BodyText"/>
+      </w:pPr>
+      <w:r>
+        <w:t xml:space="preserve">Firke, Sam, Bill Denney, Chris Haid, Ryan Knight, Malte Grosser, and Jonathan Zadra. 2024.</w:t>
+      </w:r>
+      <w:r>
+        <w:t xml:space="preserve"> </w:t>
+      </w:r>
+      <w:r>
+        <w:t xml:space="preserve">“Janitor:</w:t>
+      </w:r>
+      <w:r>
+        <w:t xml:space="preserve"> </w:t>
+      </w:r>
+      <w:r>
+        <w:t xml:space="preserve">Simple Tools</w:t>
+      </w:r>
+      <w:r>
+        <w:t xml:space="preserve"> </w:t>
+      </w:r>
+      <w:r>
+        <w:t xml:space="preserve">for</w:t>
+      </w:r>
+      <w:r>
+        <w:t xml:space="preserve"> </w:t>
+      </w:r>
+      <w:r>
+        <w:t xml:space="preserve">Examining</w:t>
+      </w:r>
+      <w:r>
+        <w:t xml:space="preserve"> </w:t>
+      </w:r>
+      <w:r>
+        <w:t xml:space="preserve">and</w:t>
+      </w:r>
+      <w:r>
+        <w:t xml:space="preserve"> </w:t>
+      </w:r>
+      <w:r>
+        <w:t xml:space="preserve">Cleaning Dirty Data</w:t>
+      </w:r>
+      <w:r>
+        <w:t xml:space="preserve">.”</w:t>
+      </w:r>
+      <w:r>
+        <w:t xml:space="preserve"> </w:t>
+      </w:r>
+      <w:hyperlink r:id="rId83">
+        <w:r>
+          <w:rPr>
+            <w:rStyle w:val="Hyperlink"/>
+          </w:rPr>
+          <w:t xml:space="preserve">https://cran.r-project.org/web/packages/janitor/index.html</w:t>
+        </w:r>
+      </w:hyperlink>
+      <w:r>
+        <w:t xml:space="preserve"> </w:t>
+      </w:r>
+      <w:r>
+        <w:t xml:space="preserve">(January 6, 2026).</w:t>
+      </w:r>
+    </w:p>
+    <w:bookmarkEnd w:id="84"/>
+    <w:bookmarkStart w:id="86" w:name="ref-LeeperEtAl2024"/>
+    <w:p>
+      <w:pPr>
+        <w:pStyle w:val="BodyText"/>
+      </w:pPr>
+      <w:r>
+        <w:t xml:space="preserve">Leeper, Thomas J., Mauricio Vargas Sepulveda, Tom Paskhalis, Manuel Aristaran, David Gohel (rOpenSci reviewer), Lincoln Mullen (rOpenSci reviewer), and Munk School of Global Affairs and Public Policy. 2024.</w:t>
+      </w:r>
+      <w:r>
+        <w:t xml:space="preserve"> </w:t>
+      </w:r>
+      <w:r>
+        <w:t xml:space="preserve">“Tabulapdf:</w:t>
+      </w:r>
+      <w:r>
+        <w:t xml:space="preserve"> </w:t>
+      </w:r>
+      <w:r>
+        <w:t xml:space="preserve">Extract Tables</w:t>
+      </w:r>
+      <w:r>
+        <w:t xml:space="preserve"> </w:t>
+      </w:r>
+      <w:r>
+        <w:t xml:space="preserve">from</w:t>
+      </w:r>
+      <w:r>
+        <w:t xml:space="preserve"> </w:t>
+      </w:r>
+      <w:r>
+        <w:t xml:space="preserve">PDF Documents</w:t>
+      </w:r>
+      <w:r>
+        <w:t xml:space="preserve">.”</w:t>
+      </w:r>
+      <w:r>
+        <w:t xml:space="preserve"> </w:t>
+      </w:r>
+      <w:hyperlink r:id="rId85">
+        <w:r>
+          <w:rPr>
+            <w:rStyle w:val="Hyperlink"/>
+          </w:rPr>
+          <w:t xml:space="preserve">https://cran.r-project.org/web/packages/tabulapdf/index.html</w:t>
+        </w:r>
+      </w:hyperlink>
+      <w:r>
+        <w:t xml:space="preserve"> </w:t>
+      </w:r>
+      <w:r>
+        <w:t xml:space="preserve">(January 6, 2026).</w:t>
+      </w:r>
+    </w:p>
+    <w:bookmarkEnd w:id="86"/>
+    <w:bookmarkStart w:id="87" w:name="ref-SoltEtAl2019"/>
+    <w:p>
+      <w:pPr>
+        <w:pStyle w:val="BodyText"/>
+      </w:pPr>
+      <w:r>
+        <w:t xml:space="preserve">Solt, Frederick, Yuehong Cassandra Tai, Yue Hu, Hyein Ko, and Byung-Deuk Woo. 2019.</w:t>
+      </w:r>
+      <w:r>
+        <w:t xml:space="preserve"> </w:t>
+      </w:r>
+      <w:r>
+        <w:t xml:space="preserve">“</w:t>
+      </w:r>
+      <w:r>
+        <w:t xml:space="preserve">DCPOtools</w:t>
+      </w:r>
+      <w:r>
+        <w:t xml:space="preserve">:</w:t>
+      </w:r>
+      <w:r>
+        <w:t xml:space="preserve"> </w:t>
+      </w:r>
+      <w:r>
+        <w:t xml:space="preserve">Tools</w:t>
+      </w:r>
+      <w:r>
+        <w:t xml:space="preserve"> </w:t>
+      </w:r>
+      <w:r>
+        <w:t xml:space="preserve">for</w:t>
+      </w:r>
+      <w:r>
+        <w:t xml:space="preserve"> </w:t>
+      </w:r>
+      <w:r>
+        <w:t xml:space="preserve">Preparing Survey Data</w:t>
+      </w:r>
+      <w:r>
+        <w:t xml:space="preserve"> </w:t>
+      </w:r>
+      <w:r>
+        <w:t xml:space="preserve">for</w:t>
+      </w:r>
+      <w:r>
+        <w:t xml:space="preserve"> </w:t>
+      </w:r>
+      <w:r>
+        <w:t xml:space="preserve">DCPO</w:t>
+      </w:r>
+      <w:r>
+        <w:t xml:space="preserve">.”</w:t>
+      </w:r>
+      <w:r>
+        <w:t xml:space="preserve"> </w:t>
+      </w:r>
+      <w:hyperlink r:id="rId68">
+        <w:r>
+          <w:rPr>
+            <w:rStyle w:val="Hyperlink"/>
+          </w:rPr>
+          <w:t xml:space="preserve">https://github.com/fsolt/DCPOtools</w:t>
+        </w:r>
+      </w:hyperlink>
+      <w:r>
+        <w:t xml:space="preserve">.</w:t>
+      </w:r>
+    </w:p>
+    <w:bookmarkEnd w:id="87"/>
+    <w:bookmarkEnd w:id="88"/>
+    <w:bookmarkEnd w:id="89"/>
     <w:sectPr>
       <w:footnotePr>
         <w:numRestart w:val="eachSect"/>
@@ -5964,7 +6347,7 @@
         <w:t xml:space="preserve"> </w:t>
       </w:r>
       <w:r>
-        <w:t xml:space="preserve">Harmonizing aggregate data (as in SWIID) and survey data (as in DCPO), involves different challenges.</w:t>
+        <w:t xml:space="preserve">Harmonizing aggregate data (as in SWIID) and survey data (as in DCPO) involves different challenges.</w:t>
       </w:r>
       <w:r>
         <w:t xml:space="preserve"> </w:t>
@@ -6052,7 +6435,7 @@
         <w:t xml:space="preserve"> </w:t>
       </w:r>
       <w:r>
-        <w:t xml:space="preserve">also points out that programming expertise can also affect the reproducibility of the data wrangling process.</w:t>
+        <w:t xml:space="preserve">also point out that programming expertise can also affect the reproducibility of the data wrangling process.</w:t>
       </w:r>
     </w:p>
   </w:footnote>

</xml_diff>